<commit_message>
Digital twin one-click integration + inclusive-language pass
- Opt-in launcher lab/twin/launch-twin.sh; OpenPLC web -> host :8088 (Learning Path keeps :8080);
  devcontainer forwards 8088/1881/3000; twin surfaced as the advanced tier in the First Light UI.
- Inclusive language: Modbus master/slave -> client/server; whitelisting -> allow-listing;
  ableist blind -> loss-of-view; generic his -> its. DNP3 master/outstation kept (IEEE 1815) + glossary note.
- assemble_kit.sh ships design/. Rebuilt modules/curriculum/docx/pdf; verify_all 18/18.

Co-Authored-By: Claude Opus 4.8 <noreply@anthropic.com>
Claude-Session: https://claude.ai/code/session_01HUaaDm4HL8pV7A1RrqukDa
</commit_message>
<xml_diff>
--- a/modules/dnp3_module.docx
+++ b/modules/dnp3_module.docx
@@ -4710,7 +4710,7 @@
         <w:t xml:space="preserve"> </w:t>
       </w:r>
       <w:r>
-        <w:t xml:space="preserve">Detection nuance: the obvious rule — alarm when a control’s source IP isn’t the master — fires here only because the attacker kept his real IP (10.20.0.66) while forging just the DNP3 link address. A smarter attacker spoofs the master’s IP or hijacks its TCP session and evades it. See</w:t>
+        <w:t xml:space="preserve">Detection nuance: the obvious rule — alarm when a control’s source IP isn’t the master — fires here only because the attacker kept its real IP (10.20.0.66) while forging just the DNP3 link address. A smarter attacker spoofs the master’s IP or hijacks its TCP session and evades it. See</w:t>
       </w:r>
       <w:r>
         <w:t xml:space="preserve"> </w:t>
@@ -4935,7 +4935,7 @@
         <w:t xml:space="preserve"> </w:t>
       </w:r>
       <w:r>
-        <w:t xml:space="preserve">A restart is a denial-of-availability weapon in OT: while the RTU reboots, operators are blind and cannot control the site. No credentials were needed.</w:t>
+        <w:t xml:space="preserve">A restart is a denial-of-availability weapon in OT: while the RTU reboots, operators lose visibility and cannot control the site. No credentials were needed.</w:t>
       </w:r>
     </w:p>
     <w:p>
@@ -5627,7 +5627,7 @@
         <w:t xml:space="preserve"> </w:t>
       </w:r>
       <w:r>
-        <w:t xml:space="preserve">COLD RESTART (and its warm variant) will reboot an outstation on command, blinding operators to the site during recovery (frames 31–33). Combined with spoofing, it is a remote denial-of-control.</w:t>
+        <w:t xml:space="preserve">COLD RESTART (and its warm variant) will reboot an outstation on command, denying operators visibility of the site during recovery (frames 31–33). Combined with spoofing, it is a remote denial-of-control.</w:t>
       </w:r>
     </w:p>
     <w:p>
@@ -5865,7 +5865,7 @@
         <w:t xml:space="preserve"> </w:t>
       </w:r>
       <w:r>
-        <w:t xml:space="preserve">address (writing the master’s 100) and left his real IP (10.20.0.66) untouched — so source_h still reads 10.20.0.66 and the alert happens to fire.</w:t>
+        <w:t xml:space="preserve">address (writing the master’s 100) and left its real IP (10.20.0.66) untouched — so source_h still reads 10.20.0.66 and the alert happens to fire.</w:t>
       </w:r>
     </w:p>
     <w:p>
@@ -5973,13 +5973,13 @@
       </w:r>
     </w:p>
     <w:bookmarkEnd w:id="50"/>
-    <w:bookmarkStart w:id="51" w:name="X8f3dd6c97436a28181b6b5924c37554c1a4284b"/>
+    <w:bookmarkStart w:id="51" w:name="X7781c4683c8ce62d0c557dfbff950279d979c70"/>
     <w:p>
       <w:pPr>
         <w:pStyle w:val="Heading3"/>
       </w:pPr>
       <w:r>
-        <w:t xml:space="preserve">When you encrypt, you blind your network sensor</w:t>
+        <w:t xml:space="preserve">When you encrypt, your network sensor goes dark</w:t>
       </w:r>
     </w:p>
     <w:p>
@@ -6016,7 +6016,7 @@
         <w:t xml:space="preserve"> </w:t>
       </w:r>
       <w:r>
-        <w:t xml:space="preserve">blind ICSNPP; only the transport-encryption controls do.</w:t>
+        <w:t xml:space="preserve">take ICSNPP dark; only the transport-encryption controls do.</w:t>
       </w:r>
     </w:p>
     <w:p>
@@ -6474,7 +6474,7 @@
         <w:t xml:space="preserve"> </w:t>
       </w:r>
       <w:r>
-        <w:t xml:space="preserve">whose source_h is 10.20.0.66. But note that works here only because the attacker kept his real IP while forging the DNP3 link address; a smarter attacker who also spoofs the master’s IP (or hijacks its TCP session) defeats a source-IP rule. The durable detection keys on an invariant — a control with no preceding SELECT, from an unexpected session, or off the master’s baseline cadence (see</w:t>
+        <w:t xml:space="preserve">whose source_h is 10.20.0.66. But note that works here only because the attacker kept its real IP while forging the DNP3 link address; a smarter attacker who also spoofs the master’s IP (or hijacks its TCP session) defeats a source-IP rule. The durable detection keys on an invariant — a control with no preceding SELECT, from an unexpected session, or off the master’s baseline cadence (see</w:t>
       </w:r>
       <w:r>
         <w:t xml:space="preserve"> </w:t>

</xml_diff>